<commit_message>
Migrate to wordZero and improve image handling
Replace go-docx with github.com/ZeroHawkeye/wordZero (v1.6.0). Update main.go to use document.Open/Save, mute wordZero logs, and switch to run-based text replacement. Remove zip-directory rewrite and go-docx-specific code. Add paragraphText, forEachTableParagraph, contentWidthEMU and imagesPerRow logic; implement insertImageIntoParagraph to embed/rescale images (width = content/3, max 3 per row) and handle bmp->png conversion. Update README, go.mod, go.sum, template and rebuilt exe to match the migration and new image behavior.
</commit_message>
<xml_diff>
--- a/docx-converter/test-files/template.docx
+++ b/docx-converter/test-files/template.docx
@@ -135,18 +135,7 @@
                 <w:bCs/>
                 <w:lang w:val="en-US"/>
               </w:rPr>
-              <w:t>{Accessio</w:t>
-            </w:r>
-            <w:bookmarkStart w:id="0" w:name="_GoBack"/>
-            <w:bookmarkEnd w:id="0"/>
-            <w:r>
-              <w:rPr>
-                <w:rFonts w:hint="default"/>
-                <w:b/>
-                <w:bCs/>
-                <w:lang w:val="en-US"/>
-              </w:rPr>
-              <w:t>nNumber}</w:t>
+              <w:t>{AccessionNumber}</w:t>
             </w:r>
           </w:p>
         </w:tc>
@@ -916,150 +905,8 @@
         </w:rPr>
         <w:t>:{ReportDateValue}</w:t>
       </w:r>
-    </w:p>
-    <w:p>
-      <w:pPr>
-        <w:jc w:val="both"/>
-        <w:rPr>
-          <w:rFonts w:hint="default"/>
-          <w:lang w:val="en-US"/>
-        </w:rPr>
-      </w:pPr>
-    </w:p>
-    <w:p>
-      <w:pPr>
-        <w:jc w:val="both"/>
-        <w:rPr>
-          <w:rFonts w:hint="default"/>
-          <w:lang w:val="en-US"/>
-        </w:rPr>
-      </w:pPr>
-    </w:p>
-    <w:p>
-      <w:pPr>
-        <w:jc w:val="both"/>
-        <w:rPr>
-          <w:rFonts w:hint="default"/>
-          <w:lang w:val="en-US"/>
-        </w:rPr>
-      </w:pPr>
-    </w:p>
-    <w:p>
-      <w:pPr>
-        <w:jc w:val="both"/>
-        <w:rPr>
-          <w:rFonts w:hint="default"/>
-          <w:lang w:val="en-US"/>
-        </w:rPr>
-      </w:pPr>
-    </w:p>
-    <w:p>
-      <w:pPr>
-        <w:jc w:val="both"/>
-        <w:rPr>
-          <w:rFonts w:hint="default"/>
-          <w:lang w:val="en-US"/>
-        </w:rPr>
-      </w:pPr>
-    </w:p>
-    <w:p>
-      <w:pPr>
-        <w:jc w:val="both"/>
-        <w:rPr>
-          <w:rFonts w:hint="default"/>
-          <w:lang w:val="en-US"/>
-        </w:rPr>
-      </w:pPr>
-    </w:p>
-    <w:p>
-      <w:pPr>
-        <w:jc w:val="both"/>
-        <w:rPr>
-          <w:rFonts w:hint="default"/>
-          <w:lang w:val="en-US"/>
-        </w:rPr>
-      </w:pPr>
-    </w:p>
-    <w:p>
-      <w:pPr>
-        <w:jc w:val="both"/>
-        <w:rPr>
-          <w:rFonts w:hint="default"/>
-          <w:lang w:val="en-US"/>
-        </w:rPr>
-      </w:pPr>
-    </w:p>
-    <w:p>
-      <w:pPr>
-        <w:jc w:val="both"/>
-        <w:rPr>
-          <w:rFonts w:hint="default"/>
-          <w:lang w:val="en-US"/>
-        </w:rPr>
-      </w:pPr>
-    </w:p>
-    <w:p>
-      <w:pPr>
-        <w:jc w:val="both"/>
-        <w:rPr>
-          <w:rFonts w:hint="default"/>
-          <w:lang w:val="en-US"/>
-        </w:rPr>
-      </w:pPr>
-    </w:p>
-    <w:p>
-      <w:pPr>
-        <w:jc w:val="both"/>
-        <w:rPr>
-          <w:rFonts w:hint="default"/>
-          <w:lang w:val="en-US"/>
-        </w:rPr>
-      </w:pPr>
-    </w:p>
-    <w:p>
-      <w:pPr>
-        <w:jc w:val="both"/>
-        <w:rPr>
-          <w:rFonts w:hint="default"/>
-          <w:lang w:val="en-US"/>
-        </w:rPr>
-      </w:pPr>
-    </w:p>
-    <w:p>
-      <w:pPr>
-        <w:jc w:val="both"/>
-        <w:rPr>
-          <w:rFonts w:hint="default"/>
-          <w:lang w:val="en-US"/>
-        </w:rPr>
-      </w:pPr>
-    </w:p>
-    <w:p>
-      <w:pPr>
-        <w:jc w:val="both"/>
-        <w:rPr>
-          <w:rFonts w:hint="default"/>
-          <w:lang w:val="en-US"/>
-        </w:rPr>
-      </w:pPr>
-    </w:p>
-    <w:p>
-      <w:pPr>
-        <w:jc w:val="both"/>
-        <w:rPr>
-          <w:rFonts w:hint="default"/>
-          <w:lang w:val="en-US"/>
-        </w:rPr>
-      </w:pPr>
-    </w:p>
-    <w:p>
-      <w:pPr>
-        <w:jc w:val="both"/>
-        <w:rPr>
-          <w:rFonts w:hint="default"/>
-          <w:lang w:val="en-US"/>
-        </w:rPr>
-      </w:pPr>
+      <w:bookmarkStart w:id="0" w:name="_GoBack"/>
+      <w:bookmarkEnd w:id="0"/>
     </w:p>
     <w:sectPr>
       <w:pgSz w:w="11906" w:h="16838"/>

</xml_diff>